<commit_message>
docs: glosario 68 siglas + directriz DOC-GLOSSARY-001
- Glosario de 68 siglas anadido al documento de Modelo de Negocio
- DOCX regenerado con glosario incluido
- DOC-GLOSSARY-001: todo documento extenso (>200 lineas) DEBE incluir
  glosario de siglas al final. Anadido a CLAUDE.md seccion documentacion

Co-Authored-By: Claude Opus 4.6 (1M context) <noreply@anthropic.com>
</commit_message>
<xml_diff>
--- a/docs/negocio/2026-03-20_Modelo_Negocio_Sistema_Precios_Jaraba_Impact_Platform_v1.docx
+++ b/docs/negocio/2026-03-20_Modelo_Negocio_Sistema_Precios_Jaraba_Impact_Platform_v1.docx
@@ -81,9 +81,9 @@
       </w:r>
     </w:p>
     <w:p>
-      <w:r>
-        <w:t>__________________________________________________</w:t>
-      </w:r>
+      <w:pPr>
+        <w:spacing w:before="120" w:after="120"/>
+      </w:pPr>
     </w:p>
     <w:p>
       <w:pPr>
@@ -292,9 +292,18 @@
       </w:r>
     </w:p>
     <w:p>
+      <w:pPr>
+        <w:pStyle w:val="ListNumber"/>
+        <w:spacing w:after="40"/>
+      </w:pPr>
       <w:r>
-        <w:t>__________________________________________________</w:t>
+        <w:t>[Glosario de Siglas](#glosario-de-siglas)</w:t>
       </w:r>
+    </w:p>
+    <w:p>
+      <w:pPr>
+        <w:spacing w:before="120" w:after="120"/>
+      </w:pPr>
     </w:p>
     <w:p>
       <w:pPr>
@@ -767,9 +776,9 @@
       </w:r>
     </w:p>
     <w:p>
-      <w:r>
-        <w:t>__________________________________________________</w:t>
-      </w:r>
+      <w:pPr>
+        <w:spacing w:before="120" w:after="120"/>
+      </w:pPr>
     </w:p>
     <w:p>
       <w:pPr>
@@ -905,9 +914,9 @@
       </w:r>
     </w:p>
     <w:p>
-      <w:r>
-        <w:t>__________________________________________________</w:t>
-      </w:r>
+      <w:pPr>
+        <w:spacing w:before="120" w:after="120"/>
+      </w:pPr>
     </w:p>
     <w:p>
       <w:pPr>
@@ -2208,9 +2217,9 @@
       </w:r>
     </w:p>
     <w:p>
-      <w:r>
-        <w:t>__________________________________________________</w:t>
-      </w:r>
+      <w:pPr>
+        <w:spacing w:before="120" w:after="120"/>
+      </w:pPr>
     </w:p>
     <w:p>
       <w:pPr>
@@ -3001,9 +3010,9 @@
       </w:tr>
     </w:tbl>
     <w:p>
-      <w:r>
-        <w:t>__________________________________________________</w:t>
-      </w:r>
+      <w:pPr>
+        <w:spacing w:before="120" w:after="120"/>
+      </w:pPr>
     </w:p>
     <w:p>
       <w:pPr>
@@ -3562,7 +3571,7 @@
               <w:rPr>
                 <w:sz w:val="18"/>
               </w:rPr>
-              <w:t>**JarabaLex**</w:t>
+              <w:t>JarabaLex</w:t>
             </w:r>
           </w:p>
         </w:tc>
@@ -3575,7 +3584,7 @@
               <w:rPr>
                 <w:sz w:val="18"/>
               </w:rPr>
-              <w:t>**Suite integral + IA**</w:t>
+              <w:t>Suite integral + IA</w:t>
             </w:r>
           </w:p>
         </w:tc>
@@ -3588,7 +3597,7 @@
               <w:rPr>
                 <w:sz w:val="18"/>
               </w:rPr>
-              <w:t>**49-299 EUR**</w:t>
+              <w:t>49-299 EUR</w:t>
             </w:r>
           </w:p>
         </w:tc>
@@ -3601,7 +3610,7 @@
               <w:rPr>
                 <w:sz w:val="18"/>
               </w:rPr>
-              <w:t>**Disruptivo: IA nativa + precio 40% menor**</w:t>
+              <w:t>Disruptivo: IA nativa + precio 40% menor</w:t>
             </w:r>
           </w:p>
         </w:tc>
@@ -3932,7 +3941,7 @@
               <w:rPr>
                 <w:sz w:val="18"/>
               </w:rPr>
-              <w:t>**Interno**</w:t>
+              <w:t>Interno</w:t>
             </w:r>
           </w:p>
         </w:tc>
@@ -3973,7 +3982,7 @@
               <w:rPr>
                 <w:sz w:val="18"/>
               </w:rPr>
-              <w:t>**Externo**</w:t>
+              <w:t>Externo</w:t>
             </w:r>
           </w:p>
         </w:tc>
@@ -4050,9 +4059,9 @@
       </w:r>
     </w:p>
     <w:p>
-      <w:r>
-        <w:t>__________________________________________________</w:t>
-      </w:r>
+      <w:pPr>
+        <w:spacing w:before="120" w:after="120"/>
+      </w:pPr>
     </w:p>
     <w:p>
       <w:pPr>
@@ -4558,7 +4567,7 @@
               <w:rPr>
                 <w:sz w:val="18"/>
               </w:rPr>
-              <w:t>**AgroConecta**</w:t>
+              <w:t>AgroConecta</w:t>
             </w:r>
           </w:p>
         </w:tc>
@@ -4571,7 +4580,7 @@
               <w:rPr>
                 <w:sz w:val="18"/>
               </w:rPr>
-              <w:t>**Suite completa + IA**</w:t>
+              <w:t>Suite completa + IA</w:t>
             </w:r>
           </w:p>
         </w:tc>
@@ -4584,7 +4593,7 @@
               <w:rPr>
                 <w:sz w:val="18"/>
               </w:rPr>
-              <w:t>**39-249 EUR**</w:t>
+              <w:t>39-249 EUR</w:t>
             </w:r>
           </w:p>
         </w:tc>
@@ -4597,7 +4606,7 @@
               <w:rPr>
                 <w:sz w:val="18"/>
               </w:rPr>
-              <w:t>**Unico: trazabilidad+marketplace+logistica+IA**</w:t>
+              <w:t>Unico: trazabilidad+marketplace+logistica+IA</w:t>
             </w:r>
           </w:p>
         </w:tc>
@@ -4886,9 +4895,9 @@
       </w:r>
     </w:p>
     <w:p>
-      <w:r>
-        <w:t>__________________________________________________</w:t>
-      </w:r>
+      <w:pPr>
+        <w:spacing w:before="120" w:after="120"/>
+      </w:pPr>
     </w:p>
     <w:p>
       <w:pPr>
@@ -5234,9 +5243,9 @@
       </w:r>
     </w:p>
     <w:p>
-      <w:r>
-        <w:t>__________________________________________________</w:t>
-      </w:r>
+      <w:pPr>
+        <w:spacing w:before="120" w:after="120"/>
+      </w:pPr>
     </w:p>
     <w:p>
       <w:pPr>
@@ -5555,7 +5564,7 @@
               <w:rPr>
                 <w:sz w:val="18"/>
               </w:rPr>
-              <w:t>**Empleabilidad**</w:t>
+              <w:t>Empleabilidad</w:t>
             </w:r>
           </w:p>
         </w:tc>
@@ -5568,7 +5577,7 @@
               <w:rPr>
                 <w:sz w:val="18"/>
               </w:rPr>
-              <w:t>**19-199 EUR**</w:t>
+              <w:t>19-199 EUR</w:t>
             </w:r>
           </w:p>
         </w:tc>
@@ -5581,7 +5590,7 @@
               <w:rPr>
                 <w:sz w:val="18"/>
               </w:rPr>
-              <w:t>**Suite unica en Espana**</w:t>
+              <w:t>Suite unica en Espana</w:t>
             </w:r>
           </w:p>
         </w:tc>
@@ -5866,9 +5875,9 @@
       </w:r>
     </w:p>
     <w:p>
-      <w:r>
-        <w:t>__________________________________________________</w:t>
-      </w:r>
+      <w:pPr>
+        <w:spacing w:before="120" w:after="120"/>
+      </w:pPr>
     </w:p>
     <w:p>
       <w:pPr>
@@ -6242,9 +6251,9 @@
       </w:r>
     </w:p>
     <w:p>
-      <w:r>
-        <w:t>__________________________________________________</w:t>
-      </w:r>
+      <w:pPr>
+        <w:spacing w:before="120" w:after="120"/>
+      </w:pPr>
     </w:p>
     <w:p>
       <w:pPr>
@@ -6554,7 +6563,7 @@
               <w:rPr>
                 <w:sz w:val="18"/>
               </w:rPr>
-              <w:t>**ServiciosConecta**</w:t>
+              <w:t>ServiciosConecta</w:t>
             </w:r>
           </w:p>
         </w:tc>
@@ -6567,7 +6576,7 @@
               <w:rPr>
                 <w:sz w:val="18"/>
               </w:rPr>
-              <w:t>**19-149 EUR**</w:t>
+              <w:t>19-149 EUR</w:t>
             </w:r>
           </w:p>
         </w:tc>
@@ -6580,16 +6589,16 @@
               <w:rPr>
                 <w:sz w:val="18"/>
               </w:rPr>
-              <w:t>**Horizontal + sin comisiones**</w:t>
+              <w:t>Horizontal + sin comisiones</w:t>
             </w:r>
           </w:p>
         </w:tc>
       </w:tr>
     </w:tbl>
     <w:p>
-      <w:r>
-        <w:t>__________________________________________________</w:t>
-      </w:r>
+      <w:pPr>
+        <w:spacing w:before="120" w:after="120"/>
+      </w:pPr>
     </w:p>
     <w:p>
       <w:pPr>
@@ -6918,9 +6927,9 @@
       </w:r>
     </w:p>
     <w:p>
-      <w:r>
-        <w:t>__________________________________________________</w:t>
-      </w:r>
+      <w:pPr>
+        <w:spacing w:before="120" w:after="120"/>
+      </w:pPr>
     </w:p>
     <w:p>
       <w:pPr>
@@ -7230,7 +7239,7 @@
               <w:rPr>
                 <w:sz w:val="18"/>
               </w:rPr>
-              <w:t>**Formacion**</w:t>
+              <w:t>Formacion</w:t>
             </w:r>
           </w:p>
         </w:tc>
@@ -7243,7 +7252,7 @@
               <w:rPr>
                 <w:sz w:val="18"/>
               </w:rPr>
-              <w:t>**29-149 EUR**</w:t>
+              <w:t>29-149 EUR</w:t>
             </w:r>
           </w:p>
         </w:tc>
@@ -7256,16 +7265,16 @@
               <w:rPr>
                 <w:sz w:val="18"/>
               </w:rPr>
-              <w:t>**IA generativa + gamificacion**</w:t>
+              <w:t>IA generativa + gamificacion</w:t>
             </w:r>
           </w:p>
         </w:tc>
       </w:tr>
     </w:tbl>
     <w:p>
-      <w:r>
-        <w:t>__________________________________________________</w:t>
-      </w:r>
+      <w:pPr>
+        <w:spacing w:before="120" w:after="120"/>
+      </w:pPr>
     </w:p>
     <w:p>
       <w:pPr>
@@ -7376,7 +7385,7 @@
               <w:rPr>
                 <w:sz w:val="18"/>
               </w:rPr>
-              <w:t>**Free**</w:t>
+              <w:t>Free</w:t>
             </w:r>
           </w:p>
         </w:tc>
@@ -7430,7 +7439,7 @@
               <w:rPr>
                 <w:sz w:val="18"/>
               </w:rPr>
-              <w:t>**Starter**</w:t>
+              <w:t>Starter</w:t>
             </w:r>
           </w:p>
         </w:tc>
@@ -7484,7 +7493,7 @@
               <w:rPr>
                 <w:sz w:val="18"/>
               </w:rPr>
-              <w:t>**Professional**</w:t>
+              <w:t>Professional</w:t>
             </w:r>
           </w:p>
         </w:tc>
@@ -7538,7 +7547,7 @@
               <w:rPr>
                 <w:sz w:val="18"/>
               </w:rPr>
-              <w:t>**Enterprise**</w:t>
+              <w:t>Enterprise</w:t>
             </w:r>
           </w:p>
         </w:tc>
@@ -8702,9 +8711,9 @@
       </w:r>
     </w:p>
     <w:p>
-      <w:r>
-        <w:t>__________________________________________________</w:t>
-      </w:r>
+      <w:pPr>
+        <w:spacing w:before="120" w:after="120"/>
+      </w:pPr>
     </w:p>
     <w:p>
       <w:pPr>
@@ -9530,9 +9539,9 @@
       </w:tr>
     </w:tbl>
     <w:p>
-      <w:r>
-        <w:t>__________________________________________________</w:t>
-      </w:r>
+      <w:pPr>
+        <w:spacing w:before="120" w:after="120"/>
+      </w:pPr>
     </w:p>
     <w:p>
       <w:pPr>
@@ -9556,9 +9565,9 @@
       </w:r>
     </w:p>
     <w:p>
-      <w:r>
-        <w:t>__________________________________________________</w:t>
-      </w:r>
+      <w:pPr>
+        <w:spacing w:before="120" w:after="120"/>
+      </w:pPr>
     </w:p>
     <w:p>
       <w:pPr>
@@ -10577,9 +10586,9 @@
       </w:tr>
     </w:tbl>
     <w:p>
-      <w:r>
-        <w:t>__________________________________________________</w:t>
-      </w:r>
+      <w:pPr>
+        <w:spacing w:before="120" w:after="120"/>
+      </w:pPr>
     </w:p>
     <w:p>
       <w:pPr>
@@ -11542,9 +11551,9 @@
       </w:tr>
     </w:tbl>
     <w:p>
-      <w:r>
-        <w:t>__________________________________________________</w:t>
-      </w:r>
+      <w:pPr>
+        <w:spacing w:before="120" w:after="120"/>
+      </w:pPr>
     </w:p>
     <w:p>
       <w:pPr>
@@ -11957,9 +11966,9 @@
       </w:r>
     </w:p>
     <w:p>
-      <w:r>
-        <w:t>__________________________________________________</w:t>
-      </w:r>
+      <w:pPr>
+        <w:spacing w:before="120" w:after="120"/>
+      </w:pPr>
     </w:p>
     <w:p>
       <w:pPr>
@@ -12502,7 +12511,7 @@
               <w:rPr>
                 <w:sz w:val="18"/>
               </w:rPr>
-              <w:t>**TOTAL**</w:t>
+              <w:t>TOTAL</w:t>
             </w:r>
           </w:p>
         </w:tc>
@@ -12515,7 +12524,7 @@
               <w:rPr>
                 <w:sz w:val="18"/>
               </w:rPr>
-              <w:t>**804.240**</w:t>
+              <w:t>804.240</w:t>
             </w:r>
           </w:p>
         </w:tc>
@@ -12528,7 +12537,7 @@
               <w:rPr>
                 <w:sz w:val="18"/>
               </w:rPr>
-              <w:t>**4.284.000**</w:t>
+              <w:t>4.284.000</w:t>
             </w:r>
           </w:p>
         </w:tc>
@@ -12541,7 +12550,7 @@
               <w:rPr>
                 <w:sz w:val="18"/>
               </w:rPr>
-              <w:t>**9.048.000**</w:t>
+              <w:t>9.048.000</w:t>
             </w:r>
           </w:p>
         </w:tc>
@@ -12601,9 +12610,9 @@
       </w:r>
     </w:p>
     <w:p>
-      <w:r>
-        <w:t>__________________________________________________</w:t>
-      </w:r>
+      <w:pPr>
+        <w:spacing w:before="120" w:after="120"/>
+      </w:pPr>
     </w:p>
     <w:p>
       <w:pPr>
@@ -12737,7 +12746,7 @@
               <w:rPr>
                 <w:sz w:val="18"/>
               </w:rPr>
-              <w:t>**Dispersion de recursos** (8 verticales)</w:t>
+              <w:t>Dispersion de recursos (8 verticales)</w:t>
             </w:r>
           </w:p>
         </w:tc>
@@ -12804,7 +12813,7 @@
               <w:rPr>
                 <w:sz w:val="18"/>
               </w:rPr>
-              <w:t>**Commoditizacion por IA generica** (ChatGPT)</w:t>
+              <w:t>Commoditizacion por IA generica (ChatGPT)</w:t>
             </w:r>
           </w:p>
         </w:tc>
@@ -12871,7 +12880,7 @@
               <w:rPr>
                 <w:sz w:val="18"/>
               </w:rPr>
-              <w:t>**Kit Digital se agota**</w:t>
+              <w:t>Kit Digital se agota</w:t>
             </w:r>
           </w:p>
         </w:tc>
@@ -12938,7 +12947,7 @@
               <w:rPr>
                 <w:sz w:val="18"/>
               </w:rPr>
-              <w:t>**Incumbentes anaden IA** (Aranzadi+Microsoft)</w:t>
+              <w:t>Incumbentes anaden IA (Aranzadi+Microsoft)</w:t>
             </w:r>
           </w:p>
         </w:tc>
@@ -13005,7 +13014,7 @@
               <w:rPr>
                 <w:sz w:val="18"/>
               </w:rPr>
-              <w:t>**Baja adopcion digital en autonomos**</w:t>
+              <w:t>Baja adopcion digital en autonomos</w:t>
             </w:r>
           </w:p>
         </w:tc>
@@ -13072,7 +13081,7 @@
               <w:rPr>
                 <w:sz w:val="18"/>
               </w:rPr>
-              <w:t>**EU AI Act compliance** (alto riesgo para legal+empleo)</w:t>
+              <w:t>EU AI Act compliance (alto riesgo para legal+empleo)</w:t>
             </w:r>
           </w:p>
         </w:tc>
@@ -13139,7 +13148,7 @@
               <w:rPr>
                 <w:sz w:val="18"/>
               </w:rPr>
-              <w:t>**Churn post-trial alto**</w:t>
+              <w:t>Churn post-trial alto</w:t>
             </w:r>
           </w:p>
         </w:tc>
@@ -13206,7 +13215,7 @@
               <w:rPr>
                 <w:sz w:val="18"/>
               </w:rPr>
-              <w:t>**Ciclos de venta largos (B2G)**</w:t>
+              <w:t>Ciclos de venta largos (B2G)</w:t>
             </w:r>
           </w:p>
         </w:tc>
@@ -13252,9 +13261,9 @@
       </w:tr>
     </w:tbl>
     <w:p>
-      <w:r>
-        <w:t>__________________________________________________</w:t>
-      </w:r>
+      <w:pPr>
+        <w:spacing w:before="120" w:after="120"/>
+      </w:pPr>
     </w:p>
     <w:p>
       <w:pPr>
@@ -13278,7 +13287,7 @@
         <w:spacing w:after="40"/>
       </w:pPr>
       <w:r>
-        <w:t>[ ] Acreditacion como Agente Digitalizador ante Red.es</w:t>
+        <w:t>☐ Acreditacion como Agente Digitalizador ante Red.es</w:t>
       </w:r>
     </w:p>
     <w:p>
@@ -13287,7 +13296,7 @@
         <w:spacing w:after="40"/>
       </w:pPr>
       <w:r>
-        <w:t>[ ] Partnerships con 3 colegios de abogados andaluces</w:t>
+        <w:t>☐ Partnerships con 3 colegios de abogados andaluces</w:t>
       </w:r>
     </w:p>
     <w:p>
@@ -13296,7 +13305,7 @@
         <w:spacing w:after="40"/>
       </w:pPr>
       <w:r>
-        <w:t>[ ] Partnership con 2 cooperativas agroalimentarias</w:t>
+        <w:t>☐ Partnership con 2 cooperativas agroalimentarias</w:t>
       </w:r>
     </w:p>
     <w:p>
@@ -13305,7 +13314,7 @@
         <w:spacing w:after="40"/>
       </w:pPr>
       <w:r>
-        <w:t>[ ] Partnership con Andalucia Emprende (1 provincia piloto)</w:t>
+        <w:t>☐ Partnership con Andalucia Emprende (1 provincia piloto)</w:t>
       </w:r>
     </w:p>
     <w:p>
@@ -13314,7 +13323,7 @@
         <w:spacing w:after="40"/>
       </w:pPr>
       <w:r>
-        <w:t>[ ] Landing Kit Digital con 5 paquetes</w:t>
+        <w:t>☐ Landing Kit Digital con 5 paquetes</w:t>
       </w:r>
     </w:p>
     <w:p>
@@ -13323,7 +13332,7 @@
         <w:spacing w:after="40"/>
       </w:pPr>
       <w:r>
-        <w:t>[ ] Campana LinkedIn targeting abogados andaluces</w:t>
+        <w:t>☐ Campana LinkedIn targeting abogados andaluces</w:t>
       </w:r>
     </w:p>
     <w:p>
@@ -13340,7 +13349,7 @@
         <w:spacing w:after="40"/>
       </w:pPr>
       <w:r>
-        <w:t>[ ] Primeros 100 suscriptores de pago</w:t>
+        <w:t>☐ Primeros 100 suscriptores de pago</w:t>
       </w:r>
     </w:p>
     <w:p>
@@ -13349,7 +13358,7 @@
         <w:spacing w:after="40"/>
       </w:pPr>
       <w:r>
-        <w:t>[ ] Kit Digital: 50 bonos procesados</w:t>
+        <w:t>☐ Kit Digital: 50 bonos procesados</w:t>
       </w:r>
     </w:p>
     <w:p>
@@ -13358,7 +13367,7 @@
         <w:spacing w:after="40"/>
       </w:pPr>
       <w:r>
-        <w:t>[ ] Lanzamiento ComercioConecta via camaras de comercio</w:t>
+        <w:t>☐ Lanzamiento ComercioConecta via camaras de comercio</w:t>
       </w:r>
     </w:p>
     <w:p>
@@ -13367,7 +13376,7 @@
         <w:spacing w:after="40"/>
       </w:pPr>
       <w:r>
-        <w:t>[ ] Lanzamiento ServiciosConecta via Kit Digital</w:t>
+        <w:t>☐ Lanzamiento ServiciosConecta via Kit Digital</w:t>
       </w:r>
     </w:p>
     <w:p>
@@ -13376,7 +13385,7 @@
         <w:spacing w:after="40"/>
       </w:pPr>
       <w:r>
-        <w:t>[ ] Contenido YouTube (5 videos/mes: tutoriales + casos)</w:t>
+        <w:t>☐ Contenido YouTube (5 videos/mes: tutoriales + casos)</w:t>
       </w:r>
     </w:p>
     <w:p>
@@ -13393,7 +13402,7 @@
         <w:spacing w:after="40"/>
       </w:pPr>
       <w:r>
-        <w:t>[ ] MRR &gt; 30.000 EUR</w:t>
+        <w:t>☐ MRR &gt; 30.000 EUR</w:t>
       </w:r>
     </w:p>
     <w:p>
@@ -13402,7 +13411,7 @@
         <w:spacing w:after="40"/>
       </w:pPr>
       <w:r>
-        <w:t>[ ] 500+ usuarios de pago</w:t>
+        <w:t>☐ 500+ usuarios de pago</w:t>
       </w:r>
     </w:p>
     <w:p>
@@ -13411,7 +13420,7 @@
         <w:spacing w:after="40"/>
       </w:pPr>
       <w:r>
-        <w:t>[ ] NPS &gt; 50</w:t>
+        <w:t>☐ NPS &gt; 50</w:t>
       </w:r>
     </w:p>
     <w:p>
@@ -13420,7 +13429,7 @@
         <w:spacing w:after="40"/>
       </w:pPr>
       <w:r>
-        <w:t>[ ] Primera ronda de testimonios reales para social proof</w:t>
+        <w:t>☐ Primera ronda de testimonios reales para social proof</w:t>
       </w:r>
     </w:p>
     <w:p>
@@ -13429,7 +13438,7 @@
         <w:spacing w:after="40"/>
       </w:pPr>
       <w:r>
-        <w:t>[ ] Expansion a 2a provincia andaluza</w:t>
+        <w:t>☐ Expansion a 2a provincia andaluza</w:t>
       </w:r>
     </w:p>
     <w:p>
@@ -13446,7 +13455,7 @@
         <w:spacing w:after="40"/>
       </w:pPr>
       <w:r>
-        <w:t>[ ] Lanzamiento Formacion + Emprendimiento a escala</w:t>
+        <w:t>☐ Lanzamiento Formacion + Emprendimiento a escala</w:t>
       </w:r>
     </w:p>
     <w:p>
@@ -13455,7 +13464,7 @@
         <w:spacing w:after="40"/>
       </w:pPr>
       <w:r>
-        <w:t>[ ] Expansion a Madrid y Barcelona</w:t>
+        <w:t>☐ Expansion a Madrid y Barcelona</w:t>
       </w:r>
     </w:p>
     <w:p>
@@ -13464,7 +13473,7 @@
         <w:spacing w:after="40"/>
       </w:pPr>
       <w:r>
-        <w:t>[ ] MRR &gt; 60.000 EUR</w:t>
+        <w:t>☐ MRR &gt; 60.000 EUR</w:t>
       </w:r>
     </w:p>
     <w:p>
@@ -13473,7 +13482,7 @@
         <w:spacing w:after="40"/>
       </w:pPr>
       <w:r>
-        <w:t>[ ] 1.000+ usuarios de pago</w:t>
+        <w:t>☐ 1.000+ usuarios de pago</w:t>
       </w:r>
     </w:p>
     <w:p>
@@ -13482,13 +13491,13 @@
         <w:spacing w:after="40"/>
       </w:pPr>
       <w:r>
-        <w:t>[ ] Serie de casos de exito documentados</w:t>
+        <w:t>☐ Serie de casos de exito documentados</w:t>
       </w:r>
     </w:p>
     <w:p>
-      <w:r>
-        <w:t>__________________________________________________</w:t>
-      </w:r>
+      <w:pPr>
+        <w:spacing w:before="120" w:after="120"/>
+      </w:pPr>
     </w:p>
     <w:p>
       <w:pPr>
@@ -13649,23 +13658,2112 @@
       </w:r>
     </w:p>
     <w:p>
+      <w:pPr>
+        <w:spacing w:before="120" w:after="120"/>
+      </w:pPr>
+    </w:p>
+    <w:p>
+      <w:pPr>
+        <w:pStyle w:val="Heading1"/>
+      </w:pPr>
       <w:r>
-        <w:t>__________________________________________________</w:t>
+        <w:t>GLOSARIO DE SIGLAS</w:t>
+      </w:r>
+    </w:p>
+    <w:tbl>
+      <w:tblPr>
+        <w:tblStyle w:val="LightGrid-Accent1"/>
+        <w:tblW w:type="auto" w:w="0"/>
+        <w:jc w:val="center"/>
+        <w:tblLook w:firstColumn="1" w:firstRow="1" w:lastColumn="0" w:lastRow="0" w:noHBand="0" w:noVBand="1" w:val="04A0"/>
+      </w:tblPr>
+      <w:tblGrid>
+        <w:gridCol w:w="4320"/>
+        <w:gridCol w:w="4320"/>
+      </w:tblGrid>
+      <w:tr>
+        <w:tc>
+          <w:tcPr>
+            <w:tcW w:type="dxa" w:w="4320"/>
+          </w:tcPr>
+          <w:p>
+            <w:pPr>
+              <w:jc w:val="center"/>
+            </w:pPr>
+            <w:r>
+              <w:rPr>
+                <w:b/>
+                <w:sz w:val="18"/>
+              </w:rPr>
+              <w:t>Sigla</w:t>
+            </w:r>
+          </w:p>
+        </w:tc>
+        <w:tc>
+          <w:tcPr>
+            <w:tcW w:type="dxa" w:w="4320"/>
+          </w:tcPr>
+          <w:p>
+            <w:pPr>
+              <w:jc w:val="center"/>
+            </w:pPr>
+            <w:r>
+              <w:rPr>
+                <w:b/>
+                <w:sz w:val="18"/>
+              </w:rPr>
+              <w:t>Significado</w:t>
+            </w:r>
+          </w:p>
+        </w:tc>
+      </w:tr>
+      <w:tr>
+        <w:tc>
+          <w:tcPr>
+            <w:tcW w:type="dxa" w:w="4320"/>
+          </w:tcPr>
+          <w:p>
+            <w:r>
+              <w:rPr>
+                <w:sz w:val="18"/>
+              </w:rPr>
+              <w:t>ADA</w:t>
+            </w:r>
+          </w:p>
+        </w:tc>
+        <w:tc>
+          <w:tcPr>
+            <w:tcW w:type="dxa" w:w="4320"/>
+          </w:tcPr>
+          <w:p>
+            <w:r>
+              <w:rPr>
+                <w:sz w:val="18"/>
+              </w:rPr>
+              <w:t>Agencia Digital de Andalucia — organismo publico de la Junta que impulsa la transformacion digital</w:t>
+            </w:r>
+          </w:p>
+        </w:tc>
+      </w:tr>
+      <w:tr>
+        <w:tc>
+          <w:tcPr>
+            <w:tcW w:type="dxa" w:w="4320"/>
+          </w:tcPr>
+          <w:p>
+            <w:r>
+              <w:rPr>
+                <w:sz w:val="18"/>
+              </w:rPr>
+              <w:t>API</w:t>
+            </w:r>
+          </w:p>
+        </w:tc>
+        <w:tc>
+          <w:tcPr>
+            <w:tcW w:type="dxa" w:w="4320"/>
+          </w:tcPr>
+          <w:p>
+            <w:r>
+              <w:rPr>
+                <w:sz w:val="18"/>
+              </w:rPr>
+              <w:t>Application Programming Interface — interfaz de programacion para integracion entre sistemas</w:t>
+            </w:r>
+          </w:p>
+        </w:tc>
+      </w:tr>
+      <w:tr>
+        <w:tc>
+          <w:tcPr>
+            <w:tcW w:type="dxa" w:w="4320"/>
+          </w:tcPr>
+          <w:p>
+            <w:r>
+              <w:rPr>
+                <w:sz w:val="18"/>
+              </w:rPr>
+              <w:t>ARPU</w:t>
+            </w:r>
+          </w:p>
+        </w:tc>
+        <w:tc>
+          <w:tcPr>
+            <w:tcW w:type="dxa" w:w="4320"/>
+          </w:tcPr>
+          <w:p>
+            <w:r>
+              <w:rPr>
+                <w:sz w:val="18"/>
+              </w:rPr>
+              <w:t>Average Revenue Per User — ingreso medio por usuario (metrica SaaS)</w:t>
+            </w:r>
+          </w:p>
+        </w:tc>
+      </w:tr>
+      <w:tr>
+        <w:tc>
+          <w:tcPr>
+            <w:tcW w:type="dxa" w:w="4320"/>
+          </w:tcPr>
+          <w:p>
+            <w:r>
+              <w:rPr>
+                <w:sz w:val="18"/>
+              </w:rPr>
+              <w:t>ATA</w:t>
+            </w:r>
+          </w:p>
+        </w:tc>
+        <w:tc>
+          <w:tcPr>
+            <w:tcW w:type="dxa" w:w="4320"/>
+          </w:tcPr>
+          <w:p>
+            <w:r>
+              <w:rPr>
+                <w:sz w:val="18"/>
+              </w:rPr>
+              <w:t>Asociacion de Trabajadores Autonomos — federacion nacional de autonomos</w:t>
+            </w:r>
+          </w:p>
+        </w:tc>
+      </w:tr>
+      <w:tr>
+        <w:tc>
+          <w:tcPr>
+            <w:tcW w:type="dxa" w:w="4320"/>
+          </w:tcPr>
+          <w:p>
+            <w:r>
+              <w:rPr>
+                <w:sz w:val="18"/>
+              </w:rPr>
+              <w:t>B2B</w:t>
+            </w:r>
+          </w:p>
+        </w:tc>
+        <w:tc>
+          <w:tcPr>
+            <w:tcW w:type="dxa" w:w="4320"/>
+          </w:tcPr>
+          <w:p>
+            <w:r>
+              <w:rPr>
+                <w:sz w:val="18"/>
+              </w:rPr>
+              <w:t>Business-to-Business — modelo de venta entre empresas</w:t>
+            </w:r>
+          </w:p>
+        </w:tc>
+      </w:tr>
+      <w:tr>
+        <w:tc>
+          <w:tcPr>
+            <w:tcW w:type="dxa" w:w="4320"/>
+          </w:tcPr>
+          <w:p>
+            <w:r>
+              <w:rPr>
+                <w:sz w:val="18"/>
+              </w:rPr>
+              <w:t>B2B2C</w:t>
+            </w:r>
+          </w:p>
+        </w:tc>
+        <w:tc>
+          <w:tcPr>
+            <w:tcW w:type="dxa" w:w="4320"/>
+          </w:tcPr>
+          <w:p>
+            <w:r>
+              <w:rPr>
+                <w:sz w:val="18"/>
+              </w:rPr>
+              <w:t>Business-to-Business-to-Consumer — modelo donde se vende a empresas que a su vez atienden consumidores</w:t>
+            </w:r>
+          </w:p>
+        </w:tc>
+      </w:tr>
+      <w:tr>
+        <w:tc>
+          <w:tcPr>
+            <w:tcW w:type="dxa" w:w="4320"/>
+          </w:tcPr>
+          <w:p>
+            <w:r>
+              <w:rPr>
+                <w:sz w:val="18"/>
+              </w:rPr>
+              <w:t>B2C</w:t>
+            </w:r>
+          </w:p>
+        </w:tc>
+        <w:tc>
+          <w:tcPr>
+            <w:tcW w:type="dxa" w:w="4320"/>
+          </w:tcPr>
+          <w:p>
+            <w:r>
+              <w:rPr>
+                <w:sz w:val="18"/>
+              </w:rPr>
+              <w:t>Business-to-Consumer — modelo de venta directa al consumidor final</w:t>
+            </w:r>
+          </w:p>
+        </w:tc>
+      </w:tr>
+      <w:tr>
+        <w:tc>
+          <w:tcPr>
+            <w:tcW w:type="dxa" w:w="4320"/>
+          </w:tcPr>
+          <w:p>
+            <w:r>
+              <w:rPr>
+                <w:sz w:val="18"/>
+              </w:rPr>
+              <w:t>B2G</w:t>
+            </w:r>
+          </w:p>
+        </w:tc>
+        <w:tc>
+          <w:tcPr>
+            <w:tcW w:type="dxa" w:w="4320"/>
+          </w:tcPr>
+          <w:p>
+            <w:r>
+              <w:rPr>
+                <w:sz w:val="18"/>
+              </w:rPr>
+              <w:t>Business-to-Government — modelo de venta a administraciones publicas</w:t>
+            </w:r>
+          </w:p>
+        </w:tc>
+      </w:tr>
+      <w:tr>
+        <w:tc>
+          <w:tcPr>
+            <w:tcW w:type="dxa" w:w="4320"/>
+          </w:tcPr>
+          <w:p>
+            <w:r>
+              <w:rPr>
+                <w:sz w:val="18"/>
+              </w:rPr>
+              <w:t>BANT</w:t>
+            </w:r>
+          </w:p>
+        </w:tc>
+        <w:tc>
+          <w:tcPr>
+            <w:tcW w:type="dxa" w:w="4320"/>
+          </w:tcPr>
+          <w:p>
+            <w:r>
+              <w:rPr>
+                <w:sz w:val="18"/>
+              </w:rPr>
+              <w:t>Budget, Authority, Need, Timeline — marco de cualificacion de leads comerciales</w:t>
+            </w:r>
+          </w:p>
+        </w:tc>
+      </w:tr>
+      <w:tr>
+        <w:tc>
+          <w:tcPr>
+            <w:tcW w:type="dxa" w:w="4320"/>
+          </w:tcPr>
+          <w:p>
+            <w:r>
+              <w:rPr>
+                <w:sz w:val="18"/>
+              </w:rPr>
+              <w:t>BMC</w:t>
+            </w:r>
+          </w:p>
+        </w:tc>
+        <w:tc>
+          <w:tcPr>
+            <w:tcW w:type="dxa" w:w="4320"/>
+          </w:tcPr>
+          <w:p>
+            <w:r>
+              <w:rPr>
+                <w:sz w:val="18"/>
+              </w:rPr>
+              <w:t>Business Model Canvas — lienzo de modelo de negocio (metodologia Osterwalder)</w:t>
+            </w:r>
+          </w:p>
+        </w:tc>
+      </w:tr>
+      <w:tr>
+        <w:tc>
+          <w:tcPr>
+            <w:tcW w:type="dxa" w:w="4320"/>
+          </w:tcPr>
+          <w:p>
+            <w:r>
+              <w:rPr>
+                <w:sz w:val="18"/>
+              </w:rPr>
+              <w:t>BOE</w:t>
+            </w:r>
+          </w:p>
+        </w:tc>
+        <w:tc>
+          <w:tcPr>
+            <w:tcW w:type="dxa" w:w="4320"/>
+          </w:tcPr>
+          <w:p>
+            <w:r>
+              <w:rPr>
+                <w:sz w:val="18"/>
+              </w:rPr>
+              <w:t>Boletin Oficial del Estado — publicacion oficial de legislacion en Espana</w:t>
+            </w:r>
+          </w:p>
+        </w:tc>
+      </w:tr>
+      <w:tr>
+        <w:tc>
+          <w:tcPr>
+            <w:tcW w:type="dxa" w:w="4320"/>
+          </w:tcPr>
+          <w:p>
+            <w:r>
+              <w:rPr>
+                <w:sz w:val="18"/>
+              </w:rPr>
+              <w:t>CAGR</w:t>
+            </w:r>
+          </w:p>
+        </w:tc>
+        <w:tc>
+          <w:tcPr>
+            <w:tcW w:type="dxa" w:w="4320"/>
+          </w:tcPr>
+          <w:p>
+            <w:r>
+              <w:rPr>
+                <w:sz w:val="18"/>
+              </w:rPr>
+              <w:t>Compound Annual Growth Rate — tasa de crecimiento anual compuesto</w:t>
+            </w:r>
+          </w:p>
+        </w:tc>
+      </w:tr>
+      <w:tr>
+        <w:tc>
+          <w:tcPr>
+            <w:tcW w:type="dxa" w:w="4320"/>
+          </w:tcPr>
+          <w:p>
+            <w:r>
+              <w:rPr>
+                <w:sz w:val="18"/>
+              </w:rPr>
+              <w:t>CCAA</w:t>
+            </w:r>
+          </w:p>
+        </w:tc>
+        <w:tc>
+          <w:tcPr>
+            <w:tcW w:type="dxa" w:w="4320"/>
+          </w:tcPr>
+          <w:p>
+            <w:r>
+              <w:rPr>
+                <w:sz w:val="18"/>
+              </w:rPr>
+              <w:t>Comunidades Autonomas — divisiones administrativas territoriales de Espana</w:t>
+            </w:r>
+          </w:p>
+        </w:tc>
+      </w:tr>
+      <w:tr>
+        <w:tc>
+          <w:tcPr>
+            <w:tcW w:type="dxa" w:w="4320"/>
+          </w:tcPr>
+          <w:p>
+            <w:r>
+              <w:rPr>
+                <w:sz w:val="18"/>
+              </w:rPr>
+              <w:t>CEEI</w:t>
+            </w:r>
+          </w:p>
+        </w:tc>
+        <w:tc>
+          <w:tcPr>
+            <w:tcW w:type="dxa" w:w="4320"/>
+          </w:tcPr>
+          <w:p>
+            <w:r>
+              <w:rPr>
+                <w:sz w:val="18"/>
+              </w:rPr>
+              <w:t>Centro Europeo de Empresas e Innovacion — incubadora/aceleradora financiada por la UE</w:t>
+            </w:r>
+          </w:p>
+        </w:tc>
+      </w:tr>
+      <w:tr>
+        <w:tc>
+          <w:tcPr>
+            <w:tcW w:type="dxa" w:w="4320"/>
+          </w:tcPr>
+          <w:p>
+            <w:r>
+              <w:rPr>
+                <w:sz w:val="18"/>
+              </w:rPr>
+              <w:t>CGAE</w:t>
+            </w:r>
+          </w:p>
+        </w:tc>
+        <w:tc>
+          <w:tcPr>
+            <w:tcW w:type="dxa" w:w="4320"/>
+          </w:tcPr>
+          <w:p>
+            <w:r>
+              <w:rPr>
+                <w:sz w:val="18"/>
+              </w:rPr>
+              <w:t>Consejo General de la Abogacia Espanola — organo de gobierno de los colegios de abogados</w:t>
+            </w:r>
+          </w:p>
+        </w:tc>
+      </w:tr>
+      <w:tr>
+        <w:tc>
+          <w:tcPr>
+            <w:tcW w:type="dxa" w:w="4320"/>
+          </w:tcPr>
+          <w:p>
+            <w:r>
+              <w:rPr>
+                <w:sz w:val="18"/>
+              </w:rPr>
+              <w:t>CLM</w:t>
+            </w:r>
+          </w:p>
+        </w:tc>
+        <w:tc>
+          <w:tcPr>
+            <w:tcW w:type="dxa" w:w="4320"/>
+          </w:tcPr>
+          <w:p>
+            <w:r>
+              <w:rPr>
+                <w:sz w:val="18"/>
+              </w:rPr>
+              <w:t>Contract Lifecycle Management — gestion del ciclo de vida de contratos</w:t>
+            </w:r>
+          </w:p>
+        </w:tc>
+      </w:tr>
+      <w:tr>
+        <w:tc>
+          <w:tcPr>
+            <w:tcW w:type="dxa" w:w="4320"/>
+          </w:tcPr>
+          <w:p>
+            <w:r>
+              <w:rPr>
+                <w:sz w:val="18"/>
+              </w:rPr>
+              <w:t>CRM</w:t>
+            </w:r>
+          </w:p>
+        </w:tc>
+        <w:tc>
+          <w:tcPr>
+            <w:tcW w:type="dxa" w:w="4320"/>
+          </w:tcPr>
+          <w:p>
+            <w:r>
+              <w:rPr>
+                <w:sz w:val="18"/>
+              </w:rPr>
+              <w:t>Customer Relationship Management — gestion de relacion con clientes</w:t>
+            </w:r>
+          </w:p>
+        </w:tc>
+      </w:tr>
+      <w:tr>
+        <w:tc>
+          <w:tcPr>
+            <w:tcW w:type="dxa" w:w="4320"/>
+          </w:tcPr>
+          <w:p>
+            <w:r>
+              <w:rPr>
+                <w:sz w:val="18"/>
+              </w:rPr>
+              <w:t>CSP</w:t>
+            </w:r>
+          </w:p>
+        </w:tc>
+        <w:tc>
+          <w:tcPr>
+            <w:tcW w:type="dxa" w:w="4320"/>
+          </w:tcPr>
+          <w:p>
+            <w:r>
+              <w:rPr>
+                <w:sz w:val="18"/>
+              </w:rPr>
+              <w:t>Content Security Policy — politica de seguridad de contenido web</w:t>
+            </w:r>
+          </w:p>
+        </w:tc>
+      </w:tr>
+      <w:tr>
+        <w:tc>
+          <w:tcPr>
+            <w:tcW w:type="dxa" w:w="4320"/>
+          </w:tcPr>
+          <w:p>
+            <w:r>
+              <w:rPr>
+                <w:sz w:val="18"/>
+              </w:rPr>
+              <w:t>CTA</w:t>
+            </w:r>
+          </w:p>
+        </w:tc>
+        <w:tc>
+          <w:tcPr>
+            <w:tcW w:type="dxa" w:w="4320"/>
+          </w:tcPr>
+          <w:p>
+            <w:r>
+              <w:rPr>
+                <w:sz w:val="18"/>
+              </w:rPr>
+              <w:t>Call to Action — elemento de la interfaz que invita al usuario a realizar una accion</w:t>
+            </w:r>
+          </w:p>
+        </w:tc>
+      </w:tr>
+      <w:tr>
+        <w:tc>
+          <w:tcPr>
+            <w:tcW w:type="dxa" w:w="4320"/>
+          </w:tcPr>
+          <w:p>
+            <w:r>
+              <w:rPr>
+                <w:sz w:val="18"/>
+              </w:rPr>
+              <w:t>CUE</w:t>
+            </w:r>
+          </w:p>
+        </w:tc>
+        <w:tc>
+          <w:tcPr>
+            <w:tcW w:type="dxa" w:w="4320"/>
+          </w:tcPr>
+          <w:p>
+            <w:r>
+              <w:rPr>
+                <w:sz w:val="18"/>
+              </w:rPr>
+              <w:t>Cuaderno Digital de Explotacion Agricola — registro obligatorio PAC 2025</w:t>
+            </w:r>
+          </w:p>
+        </w:tc>
+      </w:tr>
+      <w:tr>
+        <w:tc>
+          <w:tcPr>
+            <w:tcW w:type="dxa" w:w="4320"/>
+          </w:tcPr>
+          <w:p>
+            <w:r>
+              <w:rPr>
+                <w:sz w:val="18"/>
+              </w:rPr>
+              <w:t>DAFO</w:t>
+            </w:r>
+          </w:p>
+        </w:tc>
+        <w:tc>
+          <w:tcPr>
+            <w:tcW w:type="dxa" w:w="4320"/>
+          </w:tcPr>
+          <w:p>
+            <w:r>
+              <w:rPr>
+                <w:sz w:val="18"/>
+              </w:rPr>
+              <w:t>Debilidades, Amenazas, Fortalezas, Oportunidades — analisis estrategico (equivalente a SWOT)</w:t>
+            </w:r>
+          </w:p>
+        </w:tc>
+      </w:tr>
+      <w:tr>
+        <w:tc>
+          <w:tcPr>
+            <w:tcW w:type="dxa" w:w="4320"/>
+          </w:tcPr>
+          <w:p>
+            <w:r>
+              <w:rPr>
+                <w:sz w:val="18"/>
+              </w:rPr>
+              <w:t>DIRCE</w:t>
+            </w:r>
+          </w:p>
+        </w:tc>
+        <w:tc>
+          <w:tcPr>
+            <w:tcW w:type="dxa" w:w="4320"/>
+          </w:tcPr>
+          <w:p>
+            <w:r>
+              <w:rPr>
+                <w:sz w:val="18"/>
+              </w:rPr>
+              <w:t>Directorio Central de Empresas — registro estadistico de empresas del INE</w:t>
+            </w:r>
+          </w:p>
+        </w:tc>
+      </w:tr>
+      <w:tr>
+        <w:tc>
+          <w:tcPr>
+            <w:tcW w:type="dxa" w:w="4320"/>
+          </w:tcPr>
+          <w:p>
+            <w:r>
+              <w:rPr>
+                <w:sz w:val="18"/>
+              </w:rPr>
+              <w:t>DI</w:t>
+            </w:r>
+          </w:p>
+        </w:tc>
+        <w:tc>
+          <w:tcPr>
+            <w:tcW w:type="dxa" w:w="4320"/>
+          </w:tcPr>
+          <w:p>
+            <w:r>
+              <w:rPr>
+                <w:sz w:val="18"/>
+              </w:rPr>
+              <w:t>Dependency Injection — patron de inyeccion de dependencias en Drupal</w:t>
+            </w:r>
+          </w:p>
+        </w:tc>
+      </w:tr>
+      <w:tr>
+        <w:tc>
+          <w:tcPr>
+            <w:tcW w:type="dxa" w:w="4320"/>
+          </w:tcPr>
+          <w:p>
+            <w:r>
+              <w:rPr>
+                <w:sz w:val="18"/>
+              </w:rPr>
+              <w:t>EU AI Act</w:t>
+            </w:r>
+          </w:p>
+        </w:tc>
+        <w:tc>
+          <w:tcPr>
+            <w:tcW w:type="dxa" w:w="4320"/>
+          </w:tcPr>
+          <w:p>
+            <w:r>
+              <w:rPr>
+                <w:sz w:val="18"/>
+              </w:rPr>
+              <w:t>Reglamento Europeo de Inteligencia Artificial — normativa de la UE sobre IA</w:t>
+            </w:r>
+          </w:p>
+        </w:tc>
+      </w:tr>
+      <w:tr>
+        <w:tc>
+          <w:tcPr>
+            <w:tcW w:type="dxa" w:w="4320"/>
+          </w:tcPr>
+          <w:p>
+            <w:r>
+              <w:rPr>
+                <w:sz w:val="18"/>
+              </w:rPr>
+              <w:t>EUR</w:t>
+            </w:r>
+          </w:p>
+        </w:tc>
+        <w:tc>
+          <w:tcPr>
+            <w:tcW w:type="dxa" w:w="4320"/>
+          </w:tcPr>
+          <w:p>
+            <w:r>
+              <w:rPr>
+                <w:sz w:val="18"/>
+              </w:rPr>
+              <w:t>Euro — moneda oficial de la zona euro</w:t>
+            </w:r>
+          </w:p>
+        </w:tc>
+      </w:tr>
+      <w:tr>
+        <w:tc>
+          <w:tcPr>
+            <w:tcW w:type="dxa" w:w="4320"/>
+          </w:tcPr>
+          <w:p>
+            <w:r>
+              <w:rPr>
+                <w:sz w:val="18"/>
+              </w:rPr>
+              <w:t>FSE+</w:t>
+            </w:r>
+          </w:p>
+        </w:tc>
+        <w:tc>
+          <w:tcPr>
+            <w:tcW w:type="dxa" w:w="4320"/>
+          </w:tcPr>
+          <w:p>
+            <w:r>
+              <w:rPr>
+                <w:sz w:val="18"/>
+              </w:rPr>
+              <w:t>Fondo Social Europeo Plus — instrumento financiero de la UE para empleo e inclusion</w:t>
+            </w:r>
+          </w:p>
+        </w:tc>
+      </w:tr>
+      <w:tr>
+        <w:tc>
+          <w:tcPr>
+            <w:tcW w:type="dxa" w:w="4320"/>
+          </w:tcPr>
+          <w:p>
+            <w:r>
+              <w:rPr>
+                <w:sz w:val="18"/>
+              </w:rPr>
+              <w:t>FUNDAE</w:t>
+            </w:r>
+          </w:p>
+        </w:tc>
+        <w:tc>
+          <w:tcPr>
+            <w:tcW w:type="dxa" w:w="4320"/>
+          </w:tcPr>
+          <w:p>
+            <w:r>
+              <w:rPr>
+                <w:sz w:val="18"/>
+              </w:rPr>
+              <w:t>Fundacion Estatal para la Formacion en el Empleo — gestiona la formacion bonificada en Espana</w:t>
+            </w:r>
+          </w:p>
+        </w:tc>
+      </w:tr>
+      <w:tr>
+        <w:tc>
+          <w:tcPr>
+            <w:tcW w:type="dxa" w:w="4320"/>
+          </w:tcPr>
+          <w:p>
+            <w:r>
+              <w:rPr>
+                <w:sz w:val="18"/>
+              </w:rPr>
+              <w:t>HMAC</w:t>
+            </w:r>
+          </w:p>
+        </w:tc>
+        <w:tc>
+          <w:tcPr>
+            <w:tcW w:type="dxa" w:w="4320"/>
+          </w:tcPr>
+          <w:p>
+            <w:r>
+              <w:rPr>
+                <w:sz w:val="18"/>
+              </w:rPr>
+              <w:t>Hash-based Message Authentication Code — mecanismo de autenticacion criptografica</w:t>
+            </w:r>
+          </w:p>
+        </w:tc>
+      </w:tr>
+      <w:tr>
+        <w:tc>
+          <w:tcPr>
+            <w:tcW w:type="dxa" w:w="4320"/>
+          </w:tcPr>
+          <w:p>
+            <w:r>
+              <w:rPr>
+                <w:sz w:val="18"/>
+              </w:rPr>
+              <w:t>IA</w:t>
+            </w:r>
+          </w:p>
+        </w:tc>
+        <w:tc>
+          <w:tcPr>
+            <w:tcW w:type="dxa" w:w="4320"/>
+          </w:tcPr>
+          <w:p>
+            <w:r>
+              <w:rPr>
+                <w:sz w:val="18"/>
+              </w:rPr>
+              <w:t>Inteligencia Artificial</w:t>
+            </w:r>
+          </w:p>
+        </w:tc>
+      </w:tr>
+      <w:tr>
+        <w:tc>
+          <w:tcPr>
+            <w:tcW w:type="dxa" w:w="4320"/>
+          </w:tcPr>
+          <w:p>
+            <w:r>
+              <w:rPr>
+                <w:sz w:val="18"/>
+              </w:rPr>
+              <w:t>IGIC</w:t>
+            </w:r>
+          </w:p>
+        </w:tc>
+        <w:tc>
+          <w:tcPr>
+            <w:tcW w:type="dxa" w:w="4320"/>
+          </w:tcPr>
+          <w:p>
+            <w:r>
+              <w:rPr>
+                <w:sz w:val="18"/>
+              </w:rPr>
+              <w:t>Impuesto General Indirecto Canario — impuesto de Canarias equivalente al IVA (7%)</w:t>
+            </w:r>
+          </w:p>
+        </w:tc>
+      </w:tr>
+      <w:tr>
+        <w:tc>
+          <w:tcPr>
+            <w:tcW w:type="dxa" w:w="4320"/>
+          </w:tcPr>
+          <w:p>
+            <w:r>
+              <w:rPr>
+                <w:sz w:val="18"/>
+              </w:rPr>
+              <w:t>INE</w:t>
+            </w:r>
+          </w:p>
+        </w:tc>
+        <w:tc>
+          <w:tcPr>
+            <w:tcW w:type="dxa" w:w="4320"/>
+          </w:tcPr>
+          <w:p>
+            <w:r>
+              <w:rPr>
+                <w:sz w:val="18"/>
+              </w:rPr>
+              <w:t>Instituto Nacional de Estadistica — organismo oficial de estadisticas de Espana</w:t>
+            </w:r>
+          </w:p>
+        </w:tc>
+      </w:tr>
+      <w:tr>
+        <w:tc>
+          <w:tcPr>
+            <w:tcW w:type="dxa" w:w="4320"/>
+          </w:tcPr>
+          <w:p>
+            <w:r>
+              <w:rPr>
+                <w:sz w:val="18"/>
+              </w:rPr>
+              <w:t>IONOS</w:t>
+            </w:r>
+          </w:p>
+        </w:tc>
+        <w:tc>
+          <w:tcPr>
+            <w:tcW w:type="dxa" w:w="4320"/>
+          </w:tcPr>
+          <w:p>
+            <w:r>
+              <w:rPr>
+                <w:sz w:val="18"/>
+              </w:rPr>
+              <w:t>Proveedor de hosting europeo donde se aloja la plataforma</w:t>
+            </w:r>
+          </w:p>
+        </w:tc>
+      </w:tr>
+      <w:tr>
+        <w:tc>
+          <w:tcPr>
+            <w:tcW w:type="dxa" w:w="4320"/>
+          </w:tcPr>
+          <w:p>
+            <w:r>
+              <w:rPr>
+                <w:sz w:val="18"/>
+              </w:rPr>
+              <w:t>IPSI</w:t>
+            </w:r>
+          </w:p>
+        </w:tc>
+        <w:tc>
+          <w:tcPr>
+            <w:tcW w:type="dxa" w:w="4320"/>
+          </w:tcPr>
+          <w:p>
+            <w:r>
+              <w:rPr>
+                <w:sz w:val="18"/>
+              </w:rPr>
+              <w:t>Impuesto sobre la Produccion, los Servicios y la Importacion — impuesto de Ceuta y Melilla</w:t>
+            </w:r>
+          </w:p>
+        </w:tc>
+      </w:tr>
+      <w:tr>
+        <w:tc>
+          <w:tcPr>
+            <w:tcW w:type="dxa" w:w="4320"/>
+          </w:tcPr>
+          <w:p>
+            <w:r>
+              <w:rPr>
+                <w:sz w:val="18"/>
+              </w:rPr>
+              <w:t>IVA</w:t>
+            </w:r>
+          </w:p>
+        </w:tc>
+        <w:tc>
+          <w:tcPr>
+            <w:tcW w:type="dxa" w:w="4320"/>
+          </w:tcPr>
+          <w:p>
+            <w:r>
+              <w:rPr>
+                <w:sz w:val="18"/>
+              </w:rPr>
+              <w:t>Impuesto sobre el Valor Anadido — impuesto indirecto general en Espana (21%)</w:t>
+            </w:r>
+          </w:p>
+        </w:tc>
+      </w:tr>
+      <w:tr>
+        <w:tc>
+          <w:tcPr>
+            <w:tcW w:type="dxa" w:w="4320"/>
+          </w:tcPr>
+          <w:p>
+            <w:r>
+              <w:rPr>
+                <w:sz w:val="18"/>
+              </w:rPr>
+              <w:t>LCIS</w:t>
+            </w:r>
+          </w:p>
+        </w:tc>
+        <w:tc>
+          <w:tcPr>
+            <w:tcW w:type="dxa" w:w="4320"/>
+          </w:tcPr>
+          <w:p>
+            <w:r>
+              <w:rPr>
+                <w:sz w:val="18"/>
+              </w:rPr>
+              <w:t>Legal Coherence Intelligence System — sistema de 9 capas de coherencia juridica de JarabaLex</w:t>
+            </w:r>
+          </w:p>
+        </w:tc>
+      </w:tr>
+      <w:tr>
+        <w:tc>
+          <w:tcPr>
+            <w:tcW w:type="dxa" w:w="4320"/>
+          </w:tcPr>
+          <w:p>
+            <w:r>
+              <w:rPr>
+                <w:sz w:val="18"/>
+              </w:rPr>
+              <w:t>LexNET</w:t>
+            </w:r>
+          </w:p>
+        </w:tc>
+        <w:tc>
+          <w:tcPr>
+            <w:tcW w:type="dxa" w:w="4320"/>
+          </w:tcPr>
+          <w:p>
+            <w:r>
+              <w:rPr>
+                <w:sz w:val="18"/>
+              </w:rPr>
+              <w:t>Sistema telematico del CGPJ para comunicaciones judiciales electronicas</w:t>
+            </w:r>
+          </w:p>
+        </w:tc>
+      </w:tr>
+      <w:tr>
+        <w:tc>
+          <w:tcPr>
+            <w:tcW w:type="dxa" w:w="4320"/>
+          </w:tcPr>
+          <w:p>
+            <w:r>
+              <w:rPr>
+                <w:sz w:val="18"/>
+              </w:rPr>
+              <w:t>LMS</w:t>
+            </w:r>
+          </w:p>
+        </w:tc>
+        <w:tc>
+          <w:tcPr>
+            <w:tcW w:type="dxa" w:w="4320"/>
+          </w:tcPr>
+          <w:p>
+            <w:r>
+              <w:rPr>
+                <w:sz w:val="18"/>
+              </w:rPr>
+              <w:t>Learning Management System — sistema de gestion del aprendizaje</w:t>
+            </w:r>
+          </w:p>
+        </w:tc>
+      </w:tr>
+      <w:tr>
+        <w:tc>
+          <w:tcPr>
+            <w:tcW w:type="dxa" w:w="4320"/>
+          </w:tcPr>
+          <w:p>
+            <w:r>
+              <w:rPr>
+                <w:sz w:val="18"/>
+              </w:rPr>
+              <w:t>LSSI-CE</w:t>
+            </w:r>
+          </w:p>
+        </w:tc>
+        <w:tc>
+          <w:tcPr>
+            <w:tcW w:type="dxa" w:w="4320"/>
+          </w:tcPr>
+          <w:p>
+            <w:r>
+              <w:rPr>
+                <w:sz w:val="18"/>
+              </w:rPr>
+              <w:t>Ley de Servicios de la Sociedad de la Informacion y Comercio Electronico</w:t>
+            </w:r>
+          </w:p>
+        </w:tc>
+      </w:tr>
+      <w:tr>
+        <w:tc>
+          <w:tcPr>
+            <w:tcW w:type="dxa" w:w="4320"/>
+          </w:tcPr>
+          <w:p>
+            <w:r>
+              <w:rPr>
+                <w:sz w:val="18"/>
+              </w:rPr>
+              <w:t>MQL</w:t>
+            </w:r>
+          </w:p>
+        </w:tc>
+        <w:tc>
+          <w:tcPr>
+            <w:tcW w:type="dxa" w:w="4320"/>
+          </w:tcPr>
+          <w:p>
+            <w:r>
+              <w:rPr>
+                <w:sz w:val="18"/>
+              </w:rPr>
+              <w:t>Marketing Qualified Lead — lead cualificado por marketing</w:t>
+            </w:r>
+          </w:p>
+        </w:tc>
+      </w:tr>
+      <w:tr>
+        <w:tc>
+          <w:tcPr>
+            <w:tcW w:type="dxa" w:w="4320"/>
+          </w:tcPr>
+          <w:p>
+            <w:r>
+              <w:rPr>
+                <w:sz w:val="18"/>
+              </w:rPr>
+              <w:t>MRR</w:t>
+            </w:r>
+          </w:p>
+        </w:tc>
+        <w:tc>
+          <w:tcPr>
+            <w:tcW w:type="dxa" w:w="4320"/>
+          </w:tcPr>
+          <w:p>
+            <w:r>
+              <w:rPr>
+                <w:sz w:val="18"/>
+              </w:rPr>
+              <w:t>Monthly Recurring Revenue — ingreso recurrente mensual (metrica SaaS clave)</w:t>
+            </w:r>
+          </w:p>
+        </w:tc>
+      </w:tr>
+      <w:tr>
+        <w:tc>
+          <w:tcPr>
+            <w:tcW w:type="dxa" w:w="4320"/>
+          </w:tcPr>
+          <w:p>
+            <w:r>
+              <w:rPr>
+                <w:sz w:val="18"/>
+              </w:rPr>
+              <w:t>MVP</w:t>
+            </w:r>
+          </w:p>
+        </w:tc>
+        <w:tc>
+          <w:tcPr>
+            <w:tcW w:type="dxa" w:w="4320"/>
+          </w:tcPr>
+          <w:p>
+            <w:r>
+              <w:rPr>
+                <w:sz w:val="18"/>
+              </w:rPr>
+              <w:t>Minimum Viable Product — producto minimo viable</w:t>
+            </w:r>
+          </w:p>
+        </w:tc>
+      </w:tr>
+      <w:tr>
+        <w:tc>
+          <w:tcPr>
+            <w:tcW w:type="dxa" w:w="4320"/>
+          </w:tcPr>
+          <w:p>
+            <w:r>
+              <w:rPr>
+                <w:sz w:val="18"/>
+              </w:rPr>
+              <w:t>NextGenEU</w:t>
+            </w:r>
+          </w:p>
+        </w:tc>
+        <w:tc>
+          <w:tcPr>
+            <w:tcW w:type="dxa" w:w="4320"/>
+          </w:tcPr>
+          <w:p>
+            <w:r>
+              <w:rPr>
+                <w:sz w:val="18"/>
+              </w:rPr>
+              <w:t>Next Generation EU — fondo europeo de recuperacion post-COVID (750.000M EUR)</w:t>
+            </w:r>
+          </w:p>
+        </w:tc>
+      </w:tr>
+      <w:tr>
+        <w:tc>
+          <w:tcPr>
+            <w:tcW w:type="dxa" w:w="4320"/>
+          </w:tcPr>
+          <w:p>
+            <w:r>
+              <w:rPr>
+                <w:sz w:val="18"/>
+              </w:rPr>
+              <w:t>NIF/CIF</w:t>
+            </w:r>
+          </w:p>
+        </w:tc>
+        <w:tc>
+          <w:tcPr>
+            <w:tcW w:type="dxa" w:w="4320"/>
+          </w:tcPr>
+          <w:p>
+            <w:r>
+              <w:rPr>
+                <w:sz w:val="18"/>
+              </w:rPr>
+              <w:t>Numero de Identificacion Fiscal / Codigo de Identificacion Fiscal</w:t>
+            </w:r>
+          </w:p>
+        </w:tc>
+      </w:tr>
+      <w:tr>
+        <w:tc>
+          <w:tcPr>
+            <w:tcW w:type="dxa" w:w="4320"/>
+          </w:tcPr>
+          <w:p>
+            <w:r>
+              <w:rPr>
+                <w:sz w:val="18"/>
+              </w:rPr>
+              <w:t>NPS</w:t>
+            </w:r>
+          </w:p>
+        </w:tc>
+        <w:tc>
+          <w:tcPr>
+            <w:tcW w:type="dxa" w:w="4320"/>
+          </w:tcPr>
+          <w:p>
+            <w:r>
+              <w:rPr>
+                <w:sz w:val="18"/>
+              </w:rPr>
+              <w:t>Net Promoter Score — indice de satisfaccion y recomendacion (rango -100 a +100)</w:t>
+            </w:r>
+          </w:p>
+        </w:tc>
+      </w:tr>
+      <w:tr>
+        <w:tc>
+          <w:tcPr>
+            <w:tcW w:type="dxa" w:w="4320"/>
+          </w:tcPr>
+          <w:p>
+            <w:r>
+              <w:rPr>
+                <w:sz w:val="18"/>
+              </w:rPr>
+              <w:t>ONG</w:t>
+            </w:r>
+          </w:p>
+        </w:tc>
+        <w:tc>
+          <w:tcPr>
+            <w:tcW w:type="dxa" w:w="4320"/>
+          </w:tcPr>
+          <w:p>
+            <w:r>
+              <w:rPr>
+                <w:sz w:val="18"/>
+              </w:rPr>
+              <w:t>Organizacion No Gubernamental</w:t>
+            </w:r>
+          </w:p>
+        </w:tc>
+      </w:tr>
+      <w:tr>
+        <w:tc>
+          <w:tcPr>
+            <w:tcW w:type="dxa" w:w="4320"/>
+          </w:tcPr>
+          <w:p>
+            <w:r>
+              <w:rPr>
+                <w:sz w:val="18"/>
+              </w:rPr>
+              <w:t>ONTSI</w:t>
+            </w:r>
+          </w:p>
+        </w:tc>
+        <w:tc>
+          <w:tcPr>
+            <w:tcW w:type="dxa" w:w="4320"/>
+          </w:tcPr>
+          <w:p>
+            <w:r>
+              <w:rPr>
+                <w:sz w:val="18"/>
+              </w:rPr>
+              <w:t>Observatorio Nacional de Tecnologia y Sociedad — organismo de Red.es para estadisticas digitales</w:t>
+            </w:r>
+          </w:p>
+        </w:tc>
+      </w:tr>
+      <w:tr>
+        <w:tc>
+          <w:tcPr>
+            <w:tcW w:type="dxa" w:w="4320"/>
+          </w:tcPr>
+          <w:p>
+            <w:r>
+              <w:rPr>
+                <w:sz w:val="18"/>
+              </w:rPr>
+              <w:t>PAC</w:t>
+            </w:r>
+          </w:p>
+        </w:tc>
+        <w:tc>
+          <w:tcPr>
+            <w:tcW w:type="dxa" w:w="4320"/>
+          </w:tcPr>
+          <w:p>
+            <w:r>
+              <w:rPr>
+                <w:sz w:val="18"/>
+              </w:rPr>
+              <w:t>Politica Agraria Comun — politica de la UE para el sector agricola</w:t>
+            </w:r>
+          </w:p>
+        </w:tc>
+      </w:tr>
+      <w:tr>
+        <w:tc>
+          <w:tcPr>
+            <w:tcW w:type="dxa" w:w="4320"/>
+          </w:tcPr>
+          <w:p>
+            <w:r>
+              <w:rPr>
+                <w:sz w:val="18"/>
+              </w:rPr>
+              <w:t>PED</w:t>
+            </w:r>
+          </w:p>
+        </w:tc>
+        <w:tc>
+          <w:tcPr>
+            <w:tcW w:type="dxa" w:w="4320"/>
+          </w:tcPr>
+          <w:p>
+            <w:r>
+              <w:rPr>
+                <w:sz w:val="18"/>
+              </w:rPr>
+              <w:t>Plataforma de Ecosistemas Digitales — entidad promotora de Jaraba Impact Platform</w:t>
+            </w:r>
+          </w:p>
+        </w:tc>
+      </w:tr>
+      <w:tr>
+        <w:tc>
+          <w:tcPr>
+            <w:tcW w:type="dxa" w:w="4320"/>
+          </w:tcPr>
+          <w:p>
+            <w:r>
+              <w:rPr>
+                <w:sz w:val="18"/>
+              </w:rPr>
+              <w:t>PIB</w:t>
+            </w:r>
+          </w:p>
+        </w:tc>
+        <w:tc>
+          <w:tcPr>
+            <w:tcW w:type="dxa" w:w="4320"/>
+          </w:tcPr>
+          <w:p>
+            <w:r>
+              <w:rPr>
+                <w:sz w:val="18"/>
+              </w:rPr>
+              <w:t>Producto Interior Bruto</w:t>
+            </w:r>
+          </w:p>
+        </w:tc>
+      </w:tr>
+      <w:tr>
+        <w:tc>
+          <w:tcPr>
+            <w:tcW w:type="dxa" w:w="4320"/>
+          </w:tcPr>
+          <w:p>
+            <w:r>
+              <w:rPr>
+                <w:sz w:val="18"/>
+              </w:rPr>
+              <w:t>PLG</w:t>
+            </w:r>
+          </w:p>
+        </w:tc>
+        <w:tc>
+          <w:tcPr>
+            <w:tcW w:type="dxa" w:w="4320"/>
+          </w:tcPr>
+          <w:p>
+            <w:r>
+              <w:rPr>
+                <w:sz w:val="18"/>
+              </w:rPr>
+              <w:t>Product-Led Growth — estrategia de crecimiento liderada por el producto (freemium, self-service)</w:t>
+            </w:r>
+          </w:p>
+        </w:tc>
+      </w:tr>
+      <w:tr>
+        <w:tc>
+          <w:tcPr>
+            <w:tcW w:type="dxa" w:w="4320"/>
+          </w:tcPr>
+          <w:p>
+            <w:r>
+              <w:rPr>
+                <w:sz w:val="18"/>
+              </w:rPr>
+              <w:t>POS</w:t>
+            </w:r>
+          </w:p>
+        </w:tc>
+        <w:tc>
+          <w:tcPr>
+            <w:tcW w:type="dxa" w:w="4320"/>
+          </w:tcPr>
+          <w:p>
+            <w:r>
+              <w:rPr>
+                <w:sz w:val="18"/>
+              </w:rPr>
+              <w:t>Point of Sale — terminal de punto de venta fisico</w:t>
+            </w:r>
+          </w:p>
+        </w:tc>
+      </w:tr>
+      <w:tr>
+        <w:tc>
+          <w:tcPr>
+            <w:tcW w:type="dxa" w:w="4320"/>
+          </w:tcPr>
+          <w:p>
+            <w:r>
+              <w:rPr>
+                <w:sz w:val="18"/>
+              </w:rPr>
+              <w:t>PYME</w:t>
+            </w:r>
+          </w:p>
+        </w:tc>
+        <w:tc>
+          <w:tcPr>
+            <w:tcW w:type="dxa" w:w="4320"/>
+          </w:tcPr>
+          <w:p>
+            <w:r>
+              <w:rPr>
+                <w:sz w:val="18"/>
+              </w:rPr>
+              <w:t>Pequena y Mediana Empresa (&lt; 250 empleados)</w:t>
+            </w:r>
+          </w:p>
+        </w:tc>
+      </w:tr>
+      <w:tr>
+        <w:tc>
+          <w:tcPr>
+            <w:tcW w:type="dxa" w:w="4320"/>
+          </w:tcPr>
+          <w:p>
+            <w:r>
+              <w:rPr>
+                <w:sz w:val="18"/>
+              </w:rPr>
+              <w:t>QR</w:t>
+            </w:r>
+          </w:p>
+        </w:tc>
+        <w:tc>
+          <w:tcPr>
+            <w:tcW w:type="dxa" w:w="4320"/>
+          </w:tcPr>
+          <w:p>
+            <w:r>
+              <w:rPr>
+                <w:sz w:val="18"/>
+              </w:rPr>
+              <w:t>Quick Response — codigo bidimensional escaneable</w:t>
+            </w:r>
+          </w:p>
+        </w:tc>
+      </w:tr>
+      <w:tr>
+        <w:tc>
+          <w:tcPr>
+            <w:tcW w:type="dxa" w:w="4320"/>
+          </w:tcPr>
+          <w:p>
+            <w:r>
+              <w:rPr>
+                <w:sz w:val="18"/>
+              </w:rPr>
+              <w:t>Red.es</w:t>
+            </w:r>
+          </w:p>
+        </w:tc>
+        <w:tc>
+          <w:tcPr>
+            <w:tcW w:type="dxa" w:w="4320"/>
+          </w:tcPr>
+          <w:p>
+            <w:r>
+              <w:rPr>
+                <w:sz w:val="18"/>
+              </w:rPr>
+              <w:t>Entidad publica empresarial adscrita al Ministerio de Transformacion Digital</w:t>
+            </w:r>
+          </w:p>
+        </w:tc>
+      </w:tr>
+      <w:tr>
+        <w:tc>
+          <w:tcPr>
+            <w:tcW w:type="dxa" w:w="4320"/>
+          </w:tcPr>
+          <w:p>
+            <w:r>
+              <w:rPr>
+                <w:sz w:val="18"/>
+              </w:rPr>
+              <w:t>RGPD</w:t>
+            </w:r>
+          </w:p>
+        </w:tc>
+        <w:tc>
+          <w:tcPr>
+            <w:tcW w:type="dxa" w:w="4320"/>
+          </w:tcPr>
+          <w:p>
+            <w:r>
+              <w:rPr>
+                <w:sz w:val="18"/>
+              </w:rPr>
+              <w:t>Reglamento General de Proteccion de Datos — normativa europea de privacidad</w:t>
+            </w:r>
+          </w:p>
+        </w:tc>
+      </w:tr>
+      <w:tr>
+        <w:tc>
+          <w:tcPr>
+            <w:tcW w:type="dxa" w:w="4320"/>
+          </w:tcPr>
+          <w:p>
+            <w:r>
+              <w:rPr>
+                <w:sz w:val="18"/>
+              </w:rPr>
+              <w:t>ROPO</w:t>
+            </w:r>
+          </w:p>
+        </w:tc>
+        <w:tc>
+          <w:tcPr>
+            <w:tcW w:type="dxa" w:w="4320"/>
+          </w:tcPr>
+          <w:p>
+            <w:r>
+              <w:rPr>
+                <w:sz w:val="18"/>
+              </w:rPr>
+              <w:t>Registro Oficial de Productores y Operadores de medios de defensa fitosanitaria</w:t>
+            </w:r>
+          </w:p>
+        </w:tc>
+      </w:tr>
+      <w:tr>
+        <w:tc>
+          <w:tcPr>
+            <w:tcW w:type="dxa" w:w="4320"/>
+          </w:tcPr>
+          <w:p>
+            <w:r>
+              <w:rPr>
+                <w:sz w:val="18"/>
+              </w:rPr>
+              <w:t>SaaS</w:t>
+            </w:r>
+          </w:p>
+        </w:tc>
+        <w:tc>
+          <w:tcPr>
+            <w:tcW w:type="dxa" w:w="4320"/>
+          </w:tcPr>
+          <w:p>
+            <w:r>
+              <w:rPr>
+                <w:sz w:val="18"/>
+              </w:rPr>
+              <w:t>Software as a Service — modelo de software por suscripcion en la nube</w:t>
+            </w:r>
+          </w:p>
+        </w:tc>
+      </w:tr>
+      <w:tr>
+        <w:tc>
+          <w:tcPr>
+            <w:tcW w:type="dxa" w:w="4320"/>
+          </w:tcPr>
+          <w:p>
+            <w:r>
+              <w:rPr>
+                <w:sz w:val="18"/>
+              </w:rPr>
+              <w:t>SAE</w:t>
+            </w:r>
+          </w:p>
+        </w:tc>
+        <w:tc>
+          <w:tcPr>
+            <w:tcW w:type="dxa" w:w="4320"/>
+          </w:tcPr>
+          <w:p>
+            <w:r>
+              <w:rPr>
+                <w:sz w:val="18"/>
+              </w:rPr>
+              <w:t>Servicio Andaluz de Empleo — servicio publico de empleo de Andalucia</w:t>
+            </w:r>
+          </w:p>
+        </w:tc>
+      </w:tr>
+      <w:tr>
+        <w:tc>
+          <w:tcPr>
+            <w:tcW w:type="dxa" w:w="4320"/>
+          </w:tcPr>
+          <w:p>
+            <w:r>
+              <w:rPr>
+                <w:sz w:val="18"/>
+              </w:rPr>
+              <w:t>SAM</w:t>
+            </w:r>
+          </w:p>
+        </w:tc>
+        <w:tc>
+          <w:tcPr>
+            <w:tcW w:type="dxa" w:w="4320"/>
+          </w:tcPr>
+          <w:p>
+            <w:r>
+              <w:rPr>
+                <w:sz w:val="18"/>
+              </w:rPr>
+              <w:t>Serviceable Addressable Market — porcion del mercado total que se puede servir con el producto</w:t>
+            </w:r>
+          </w:p>
+        </w:tc>
+      </w:tr>
+      <w:tr>
+        <w:tc>
+          <w:tcPr>
+            <w:tcW w:type="dxa" w:w="4320"/>
+          </w:tcPr>
+          <w:p>
+            <w:r>
+              <w:rPr>
+                <w:sz w:val="18"/>
+              </w:rPr>
+              <w:t>SCSS</w:t>
+            </w:r>
+          </w:p>
+        </w:tc>
+        <w:tc>
+          <w:tcPr>
+            <w:tcW w:type="dxa" w:w="4320"/>
+          </w:tcPr>
+          <w:p>
+            <w:r>
+              <w:rPr>
+                <w:sz w:val="18"/>
+              </w:rPr>
+              <w:t>Sassy CSS — preprocesador de hojas de estilo (Dart Sass)</w:t>
+            </w:r>
+          </w:p>
+        </w:tc>
+      </w:tr>
+      <w:tr>
+        <w:tc>
+          <w:tcPr>
+            <w:tcW w:type="dxa" w:w="4320"/>
+          </w:tcPr>
+          <w:p>
+            <w:r>
+              <w:rPr>
+                <w:sz w:val="18"/>
+              </w:rPr>
+              <w:t>SEPA</w:t>
+            </w:r>
+          </w:p>
+        </w:tc>
+        <w:tc>
+          <w:tcPr>
+            <w:tcW w:type="dxa" w:w="4320"/>
+          </w:tcPr>
+          <w:p>
+            <w:r>
+              <w:rPr>
+                <w:sz w:val="18"/>
+              </w:rPr>
+              <w:t>Single Euro Payments Area — zona unica de pagos en euros (domiciliacion bancaria)</w:t>
+            </w:r>
+          </w:p>
+        </w:tc>
+      </w:tr>
+      <w:tr>
+        <w:tc>
+          <w:tcPr>
+            <w:tcW w:type="dxa" w:w="4320"/>
+          </w:tcPr>
+          <w:p>
+            <w:r>
+              <w:rPr>
+                <w:sz w:val="18"/>
+              </w:rPr>
+              <w:t>SEPE</w:t>
+            </w:r>
+          </w:p>
+        </w:tc>
+        <w:tc>
+          <w:tcPr>
+            <w:tcW w:type="dxa" w:w="4320"/>
+          </w:tcPr>
+          <w:p>
+            <w:r>
+              <w:rPr>
+                <w:sz w:val="18"/>
+              </w:rPr>
+              <w:t>Servicio Publico de Empleo Estatal — servicio nacional de empleo de Espana</w:t>
+            </w:r>
+          </w:p>
+        </w:tc>
+      </w:tr>
+      <w:tr>
+        <w:tc>
+          <w:tcPr>
+            <w:tcW w:type="dxa" w:w="4320"/>
+          </w:tcPr>
+          <w:p>
+            <w:r>
+              <w:rPr>
+                <w:sz w:val="18"/>
+              </w:rPr>
+              <w:t>SIEX</w:t>
+            </w:r>
+          </w:p>
+        </w:tc>
+        <w:tc>
+          <w:tcPr>
+            <w:tcW w:type="dxa" w:w="4320"/>
+          </w:tcPr>
+          <w:p>
+            <w:r>
+              <w:rPr>
+                <w:sz w:val="18"/>
+              </w:rPr>
+              <w:t>Sistema de Informacion de Explotaciones Agrarias y Ganaderas — registro obligatorio PAC</w:t>
+            </w:r>
+          </w:p>
+        </w:tc>
+      </w:tr>
+      <w:tr>
+        <w:tc>
+          <w:tcPr>
+            <w:tcW w:type="dxa" w:w="4320"/>
+          </w:tcPr>
+          <w:p>
+            <w:r>
+              <w:rPr>
+                <w:sz w:val="18"/>
+              </w:rPr>
+              <w:t>SLA</w:t>
+            </w:r>
+          </w:p>
+        </w:tc>
+        <w:tc>
+          <w:tcPr>
+            <w:tcW w:type="dxa" w:w="4320"/>
+          </w:tcPr>
+          <w:p>
+            <w:r>
+              <w:rPr>
+                <w:sz w:val="18"/>
+              </w:rPr>
+              <w:t>Service Level Agreement — acuerdo de nivel de servicio garantizado</w:t>
+            </w:r>
+          </w:p>
+        </w:tc>
+      </w:tr>
+      <w:tr>
+        <w:tc>
+          <w:tcPr>
+            <w:tcW w:type="dxa" w:w="4320"/>
+          </w:tcPr>
+          <w:p>
+            <w:r>
+              <w:rPr>
+                <w:sz w:val="18"/>
+              </w:rPr>
+              <w:t>SOM</w:t>
+            </w:r>
+          </w:p>
+        </w:tc>
+        <w:tc>
+          <w:tcPr>
+            <w:tcW w:type="dxa" w:w="4320"/>
+          </w:tcPr>
+          <w:p>
+            <w:r>
+              <w:rPr>
+                <w:sz w:val="18"/>
+              </w:rPr>
+              <w:t>Serviceable Obtainable Market — porcion del mercado que se puede capturar realistamente</w:t>
+            </w:r>
+          </w:p>
+        </w:tc>
+      </w:tr>
+      <w:tr>
+        <w:tc>
+          <w:tcPr>
+            <w:tcW w:type="dxa" w:w="4320"/>
+          </w:tcPr>
+          <w:p>
+            <w:r>
+              <w:rPr>
+                <w:sz w:val="18"/>
+              </w:rPr>
+              <w:t>SSE</w:t>
+            </w:r>
+          </w:p>
+        </w:tc>
+        <w:tc>
+          <w:tcPr>
+            <w:tcW w:type="dxa" w:w="4320"/>
+          </w:tcPr>
+          <w:p>
+            <w:r>
+              <w:rPr>
+                <w:sz w:val="18"/>
+              </w:rPr>
+              <w:t>Server-Sent Events — protocolo para streaming de datos del servidor al cliente</w:t>
+            </w:r>
+          </w:p>
+        </w:tc>
+      </w:tr>
+      <w:tr>
+        <w:tc>
+          <w:tcPr>
+            <w:tcW w:type="dxa" w:w="4320"/>
+          </w:tcPr>
+          <w:p>
+            <w:r>
+              <w:rPr>
+                <w:sz w:val="18"/>
+              </w:rPr>
+              <w:t>STO</w:t>
+            </w:r>
+          </w:p>
+        </w:tc>
+        <w:tc>
+          <w:tcPr>
+            <w:tcW w:type="dxa" w:w="4320"/>
+          </w:tcPr>
+          <w:p>
+            <w:r>
+              <w:rPr>
+                <w:sz w:val="18"/>
+              </w:rPr>
+              <w:t>Sistema Telematico de Orientacion — plataforma de la Junta de Andalucia para insercion laboral</w:t>
+            </w:r>
+          </w:p>
+        </w:tc>
+      </w:tr>
+      <w:tr>
+        <w:tc>
+          <w:tcPr>
+            <w:tcW w:type="dxa" w:w="4320"/>
+          </w:tcPr>
+          <w:p>
+            <w:r>
+              <w:rPr>
+                <w:sz w:val="18"/>
+              </w:rPr>
+              <w:t>TAM</w:t>
+            </w:r>
+          </w:p>
+        </w:tc>
+        <w:tc>
+          <w:tcPr>
+            <w:tcW w:type="dxa" w:w="4320"/>
+          </w:tcPr>
+          <w:p>
+            <w:r>
+              <w:rPr>
+                <w:sz w:val="18"/>
+              </w:rPr>
+              <w:t>Total Addressable Market — tamano total del mercado teorico</w:t>
+            </w:r>
+          </w:p>
+        </w:tc>
+      </w:tr>
+      <w:tr>
+        <w:tc>
+          <w:tcPr>
+            <w:tcW w:type="dxa" w:w="4320"/>
+          </w:tcPr>
+          <w:p>
+            <w:r>
+              <w:rPr>
+                <w:sz w:val="18"/>
+              </w:rPr>
+              <w:t>TIC</w:t>
+            </w:r>
+          </w:p>
+        </w:tc>
+        <w:tc>
+          <w:tcPr>
+            <w:tcW w:type="dxa" w:w="4320"/>
+          </w:tcPr>
+          <w:p>
+            <w:r>
+              <w:rPr>
+                <w:sz w:val="18"/>
+              </w:rPr>
+              <w:t>Tecnologias de la Informacion y la Comunicacion</w:t>
+            </w:r>
+          </w:p>
+        </w:tc>
+      </w:tr>
+      <w:tr>
+        <w:tc>
+          <w:tcPr>
+            <w:tcW w:type="dxa" w:w="4320"/>
+          </w:tcPr>
+          <w:p>
+            <w:r>
+              <w:rPr>
+                <w:sz w:val="18"/>
+              </w:rPr>
+              <w:t>UE</w:t>
+            </w:r>
+          </w:p>
+        </w:tc>
+        <w:tc>
+          <w:tcPr>
+            <w:tcW w:type="dxa" w:w="4320"/>
+          </w:tcPr>
+          <w:p>
+            <w:r>
+              <w:rPr>
+                <w:sz w:val="18"/>
+              </w:rPr>
+              <w:t>Union Europea</w:t>
+            </w:r>
+          </w:p>
+        </w:tc>
+      </w:tr>
+      <w:tr>
+        <w:tc>
+          <w:tcPr>
+            <w:tcW w:type="dxa" w:w="4320"/>
+          </w:tcPr>
+          <w:p>
+            <w:r>
+              <w:rPr>
+                <w:sz w:val="18"/>
+              </w:rPr>
+              <w:t>WTP</w:t>
+            </w:r>
+          </w:p>
+        </w:tc>
+        <w:tc>
+          <w:tcPr>
+            <w:tcW w:type="dxa" w:w="4320"/>
+          </w:tcPr>
+          <w:p>
+            <w:r>
+              <w:rPr>
+                <w:sz w:val="18"/>
+              </w:rPr>
+              <w:t>Willingness to Pay — disposicion a pagar del segmento de mercado</w:t>
+            </w:r>
+          </w:p>
+        </w:tc>
+      </w:tr>
+      <w:tr>
+        <w:tc>
+          <w:tcPr>
+            <w:tcW w:type="dxa" w:w="4320"/>
+          </w:tcPr>
+          <w:p>
+            <w:r>
+              <w:rPr>
+                <w:sz w:val="18"/>
+              </w:rPr>
+              <w:t>xAPI</w:t>
+            </w:r>
+          </w:p>
+        </w:tc>
+        <w:tc>
+          <w:tcPr>
+            <w:tcW w:type="dxa" w:w="4320"/>
+          </w:tcPr>
+          <w:p>
+            <w:r>
+              <w:rPr>
+                <w:sz w:val="18"/>
+              </w:rPr>
+              <w:t>Experience API — estandar de seguimiento de aprendizaje (sucesor de SCORM)</w:t>
+            </w:r>
+          </w:p>
+        </w:tc>
+      </w:tr>
+    </w:tbl>
+    <w:p>
+      <w:pPr>
+        <w:spacing w:before="120" w:after="120"/>
+      </w:pPr>
+    </w:p>
+    <w:p>
+      <w:r>
+        <w:rPr>
+          <w:i/>
+          <w:sz w:val="18"/>
+        </w:rPr>
+        <w:t>Documento generado el 20 de marzo de 2026.</w:t>
       </w:r>
     </w:p>
     <w:p>
       <w:r>
-        <w:t>*Documento generado el 20 de marzo de 2026.*</w:t>
+        <w:rPr>
+          <w:i/>
+          <w:sz w:val="18"/>
+        </w:rPr>
+        <w:t>Basado en auditoria verificada del codebase + investigacion de mercado con datos 2025-2026.</w:t>
       </w:r>
     </w:p>
     <w:p>
       <w:r>
-        <w:t>*Basado en auditoria verificada del codebase + investigacion de mercado con datos 2025-2026.*</w:t>
-      </w:r>
-    </w:p>
-    <w:p>
-      <w:r>
-        <w:t>*Jaraba Impact Platform — "Sin Humo".*</w:t>
+        <w:rPr>
+          <w:i/>
+          <w:sz w:val="18"/>
+        </w:rPr>
+        <w:t>Jaraba Impact Platform — "Sin Humo".</w:t>
       </w:r>
     </w:p>
     <w:sectPr>

</xml_diff>